<commit_message>
Update canonical resume with approved channel experience refinements
</commit_message>
<xml_diff>
--- a/data/resumes/JosephLamb_Resume.docx
+++ b/data/resumes/JosephLamb_Resume.docx
@@ -43,7 +43,7 @@
     </w:p>
     <w:p>
       <w:pPr>
-        <w:spacing w:after="120" w:line="240" w:lineRule="auto"/>
+        <w:spacing w:after="100" w:line="240" w:lineRule="auto"/>
         <w:jc w:val="center"/>
       </w:pPr>
       <w:r>
@@ -62,7 +62,7 @@
     </w:p>
     <w:p>
       <w:pPr>
-        <w:spacing w:after="80" w:line="245" w:lineRule="auto"/>
+        <w:spacing w:after="60" w:line="240" w:lineRule="auto"/>
       </w:pPr>
       <w:r>
         <w:rPr>
@@ -84,7 +84,7 @@
         <w:pBdr>
           <w:bottom w:val="single" w:sz="5" w:space="2" w:color="404040"/>
         </w:pBdr>
-        <w:spacing w:before="140" w:after="60" w:line="240" w:lineRule="auto"/>
+        <w:spacing w:before="120" w:after="60" w:line="240" w:lineRule="auto"/>
       </w:pPr>
       <w:r>
         <w:rPr>
@@ -102,7 +102,7 @@
     </w:p>
     <w:p>
       <w:pPr>
-        <w:spacing w:after="60" w:line="245" w:lineRule="auto"/>
+        <w:spacing w:after="60" w:line="240" w:lineRule="auto"/>
       </w:pPr>
       <w:r>
         <w:rPr>
@@ -124,7 +124,7 @@
         <w:pBdr>
           <w:bottom w:val="single" w:sz="5" w:space="2" w:color="404040"/>
         </w:pBdr>
-        <w:spacing w:before="140" w:after="60" w:line="240" w:lineRule="auto"/>
+        <w:spacing w:before="120" w:after="60" w:line="240" w:lineRule="auto"/>
       </w:pPr>
       <w:r>
         <w:rPr>
@@ -212,7 +212,7 @@
     <w:p>
       <w:pPr>
         <w:keepNext/>
-        <w:spacing w:after="80" w:line="245" w:lineRule="auto"/>
+        <w:spacing w:after="80" w:line="240" w:lineRule="auto"/>
       </w:pPr>
       <w:r>
         <w:rPr>
@@ -236,7 +236,7 @@
           <w:ilvl w:val="0"/>
           <w:numId w:val="1"/>
         </w:numPr>
-        <w:spacing w:after="40" w:line="245" w:lineRule="auto"/>
+        <w:spacing w:after="20" w:line="240" w:lineRule="auto"/>
         <w:ind w:left="317" w:hanging="216"/>
         <w:contextualSpacing w:val="0"/>
       </w:pPr>
@@ -251,7 +251,7 @@
           <w:caps w:val="0"/>
           <w:smallCaps w:val="0"/>
         </w:rPr>
-        <w:t xml:space="preserve">Launched the pilot B2B distributor and proved the operating model that led to a national rollout. Built its sales pipeline and led co-selling with the partner, which finished #1 nationally in net sales in 2024 and 2025.</w:t>
+        <w:t>Launched the pilot B2B partner, built its prospecting pipeline, and led outbound coaching and co-selling with partner reps. Proved the operating model that led to a national rollout; the partner finished #1 nationally in net B2B sales in 2024 and 2025.</w:t>
       </w:r>
     </w:p>
     <w:p>
@@ -262,7 +262,7 @@
           <w:ilvl w:val="0"/>
           <w:numId w:val="1"/>
         </w:numPr>
-        <w:spacing w:after="40" w:line="245" w:lineRule="auto"/>
+        <w:spacing w:after="20" w:line="240" w:lineRule="auto"/>
         <w:ind w:left="317" w:hanging="216"/>
         <w:contextualSpacing w:val="0"/>
       </w:pPr>
@@ -277,7 +277,7 @@
           <w:caps w:val="0"/>
           <w:smallCaps w:val="0"/>
         </w:rPr>
-        <w:t xml:space="preserve">Built the sales training and certification program for distributors, establishing standards for product knowledge, sales execution, and platform use. The program was later adopted and rolled out nationally.</w:t>
+        <w:t>Owned onboarding for new partner reps, from product training and certification through prospecting, quoting, and co-selling. Built the supporting curriculum, instructor guides, platform manuals, and troubleshooting resources; the training and certification program was later adopted nationally.</w:t>
       </w:r>
     </w:p>
     <w:p>
@@ -288,7 +288,7 @@
           <w:ilvl w:val="0"/>
           <w:numId w:val="1"/>
         </w:numPr>
-        <w:spacing w:after="40" w:line="245" w:lineRule="auto"/>
+        <w:spacing w:after="20" w:line="240" w:lineRule="auto"/>
         <w:ind w:left="317" w:hanging="216"/>
         <w:contextualSpacing w:val="0"/>
       </w:pPr>
@@ -314,7 +314,7 @@
           <w:ilvl w:val="0"/>
           <w:numId w:val="1"/>
         </w:numPr>
-        <w:spacing w:after="40" w:line="245" w:lineRule="auto"/>
+        <w:spacing w:after="20" w:line="240" w:lineRule="auto"/>
         <w:ind w:left="317" w:hanging="216"/>
         <w:contextualSpacing w:val="0"/>
       </w:pPr>
@@ -340,7 +340,7 @@
           <w:ilvl w:val="0"/>
           <w:numId w:val="1"/>
         </w:numPr>
-        <w:spacing w:after="40" w:line="245" w:lineRule="auto"/>
+        <w:spacing w:after="20" w:line="240" w:lineRule="auto"/>
         <w:ind w:left="317" w:hanging="216"/>
         <w:contextualSpacing w:val="0"/>
       </w:pPr>
@@ -366,7 +366,7 @@
           <w:ilvl w:val="0"/>
           <w:numId w:val="1"/>
         </w:numPr>
-        <w:spacing w:after="40" w:line="245" w:lineRule="auto"/>
+        <w:spacing w:after="20" w:line="240" w:lineRule="auto"/>
         <w:ind w:left="317" w:hanging="216"/>
         <w:contextualSpacing w:val="0"/>
       </w:pPr>
@@ -392,7 +392,7 @@
           <w:ilvl w:val="0"/>
           <w:numId w:val="1"/>
         </w:numPr>
-        <w:spacing w:after="40" w:line="245" w:lineRule="auto"/>
+        <w:spacing w:after="20" w:line="240" w:lineRule="auto"/>
         <w:ind w:left="317" w:hanging="216"/>
         <w:contextualSpacing w:val="0"/>
       </w:pPr>
@@ -407,7 +407,7 @@
           <w:caps w:val="0"/>
           <w:smallCaps w:val="0"/>
         </w:rPr>
-        <w:t xml:space="preserve">Maintained 100% account retention on Sara+ over six years by driving adoption and resolving platform issues for 1,000+ active partner users.</w:t>
+        <w:t>Maintained 100% distributor account retention on Sara+ over six years by owning onboarding and adoption for an active base of 1,000+ partner users and resolving technical barriers to selling.</w:t>
       </w:r>
     </w:p>
     <w:p>
@@ -477,7 +477,7 @@
     <w:p>
       <w:pPr>
         <w:keepNext/>
-        <w:spacing w:after="80" w:line="245" w:lineRule="auto"/>
+        <w:spacing w:after="80" w:line="240" w:lineRule="auto"/>
       </w:pPr>
       <w:r>
         <w:rPr>
@@ -501,7 +501,7 @@
           <w:ilvl w:val="0"/>
           <w:numId w:val="1"/>
         </w:numPr>
-        <w:spacing w:after="40" w:line="245" w:lineRule="auto"/>
+        <w:spacing w:after="20" w:line="240" w:lineRule="auto"/>
         <w:ind w:left="317" w:hanging="216"/>
         <w:contextualSpacing w:val="0"/>
       </w:pPr>
@@ -527,7 +527,7 @@
           <w:ilvl w:val="0"/>
           <w:numId w:val="1"/>
         </w:numPr>
-        <w:spacing w:after="40" w:line="245" w:lineRule="auto"/>
+        <w:spacing w:after="20" w:line="240" w:lineRule="auto"/>
         <w:ind w:left="317" w:hanging="216"/>
         <w:contextualSpacing w:val="0"/>
       </w:pPr>
@@ -553,7 +553,7 @@
           <w:ilvl w:val="0"/>
           <w:numId w:val="1"/>
         </w:numPr>
-        <w:spacing w:after="40" w:line="245" w:lineRule="auto"/>
+        <w:spacing w:after="20" w:line="240" w:lineRule="auto"/>
         <w:ind w:left="317" w:hanging="216"/>
         <w:contextualSpacing w:val="0"/>
       </w:pPr>
@@ -643,7 +643,7 @@
           <w:ilvl w:val="0"/>
           <w:numId w:val="1"/>
         </w:numPr>
-        <w:spacing w:after="40" w:line="245" w:lineRule="auto"/>
+        <w:spacing w:after="20" w:line="240" w:lineRule="auto"/>
         <w:ind w:left="317" w:hanging="216"/>
         <w:contextualSpacing w:val="0"/>
       </w:pPr>
@@ -669,7 +669,7 @@
           <w:ilvl w:val="0"/>
           <w:numId w:val="1"/>
         </w:numPr>
-        <w:spacing w:after="40" w:line="245" w:lineRule="auto"/>
+        <w:spacing w:after="20" w:line="240" w:lineRule="auto"/>
         <w:ind w:left="317" w:hanging="216"/>
         <w:contextualSpacing w:val="0"/>
       </w:pPr>
@@ -693,7 +693,7 @@
         <w:pBdr>
           <w:bottom w:val="single" w:sz="5" w:space="2" w:color="404040"/>
         </w:pBdr>
-        <w:spacing w:before="140" w:after="60" w:line="240" w:lineRule="auto"/>
+        <w:spacing w:before="120" w:after="60" w:line="240" w:lineRule="auto"/>
       </w:pPr>
       <w:r>
         <w:rPr>
@@ -711,7 +711,7 @@
     </w:p>
     <w:p>
       <w:pPr>
-        <w:spacing w:after="0" w:line="245" w:lineRule="auto"/>
+        <w:spacing w:after="0" w:line="240" w:lineRule="auto"/>
       </w:pPr>
       <w:r>
         <w:rPr>

</xml_diff>

<commit_message>
Update canonical resume DSI introduction and scoring binding
</commit_message>
<xml_diff>
--- a/data/resumes/JosephLamb_Resume.docx
+++ b/data/resumes/JosephLamb_Resume.docx
@@ -156,7 +156,7 @@
           <w:caps w:val="0"/>
           <w:smallCaps w:val="0"/>
         </w:rPr>
-        <w:t xml:space="preserve">DSI Systems (Minneapolis, MN)</w:t>
+        <w:t>DSI Systems | AT&amp;T Channel Sales &amp; Partner Enablement (Minneapolis, MN)</w:t>
       </w:r>
       <w:r>
         <w:rPr>
@@ -193,7 +193,7 @@
           <w:caps w:val="0"/>
           <w:smallCaps w:val="0"/>
         </w:rPr>
-        <w:t xml:space="preserve">Field Sales Representative</w:t>
+        <w:t>Channel Account Management</w:t>
       </w:r>
       <w:r>
         <w:rPr>
@@ -202,11 +202,11 @@
           <w:szCs w:val="19"/>
           <w:color w:val="000000"/>
           <w:b w:val="0"/>
-          <w:i w:val="1"/>
+          <w:i w:val="0"/>
           <w:caps w:val="0"/>
           <w:smallCaps w:val="0"/>
         </w:rPr>
-        <w:t xml:space="preserve"> — Channel Account Management | MN / WI / IA / SD</w:t>
+        <w:t xml:space="preserve"> (official title: Field Sales Representative) | MN / WI / IA / SD</w:t>
       </w:r>
     </w:p>
     <w:p>

</xml_diff>

<commit_message>
Update canonical Channel Sales Manager resume and evidence
Apply the approved resume, formal-title binding, and current evidence to future Dashboard and E-Fit work. Preserve existing score authority and historical exports.
</commit_message>
<xml_diff>
--- a/data/resumes/JosephLamb_Resume.docx
+++ b/data/resumes/JosephLamb_Resume.docx
@@ -43,7 +43,7 @@
     </w:p>
     <w:p>
       <w:pPr>
-        <w:spacing w:after="100" w:line="240" w:lineRule="auto"/>
+        <w:spacing w:after="80" w:line="230" w:lineRule="exact"/>
         <w:jc w:val="center"/>
       </w:pPr>
       <w:r>
@@ -57,12 +57,12 @@
           <w:caps w:val="0"/>
           <w:smallCaps w:val="0"/>
         </w:rPr>
-        <w:t xml:space="preserve">Channel Business Manager | Partner Development | Revenue Growth</w:t>
+        <w:t xml:space="preserve">Channel Sales Manager | Partner Development | Revenue Growth</w:t>
       </w:r>
     </w:p>
     <w:p>
       <w:pPr>
-        <w:spacing w:after="60" w:line="240" w:lineRule="auto"/>
+        <w:spacing w:after="40" w:line="230" w:lineRule="exact"/>
       </w:pPr>
       <w:r>
         <w:rPr>
@@ -75,7 +75,7 @@
           <w:caps w:val="0"/>
           <w:smallCaps w:val="0"/>
         </w:rPr>
-        <w:t xml:space="preserve">Channel business manager with 10 years of experience in sales and partner development. Builds new distributor sales operations and grows established partner businesses, with six consecutive years exceeding annual territory-growth quota.</w:t>
+        <w:t xml:space="preserve">Channel sales manager with 10 years of experience in sales and partner development, consistently exceeding quota. Launches new sales channels and partners, builds programs adopted nationally, and grows established partner businesses.</w:t>
       </w:r>
     </w:p>
     <w:p>
@@ -84,7 +84,7 @@
         <w:pBdr>
           <w:bottom w:val="single" w:sz="5" w:space="2" w:color="404040"/>
         </w:pBdr>
-        <w:spacing w:before="120" w:after="60" w:line="240" w:lineRule="auto"/>
+        <w:spacing w:before="80" w:after="40" w:line="230" w:lineRule="exact"/>
       </w:pPr>
       <w:r>
         <w:rPr>
@@ -102,7 +102,7 @@
     </w:p>
     <w:p>
       <w:pPr>
-        <w:spacing w:after="60" w:line="240" w:lineRule="auto"/>
+        <w:spacing w:after="40" w:line="230" w:lineRule="exact"/>
       </w:pPr>
       <w:r>
         <w:rPr>
@@ -124,7 +124,7 @@
         <w:pBdr>
           <w:bottom w:val="single" w:sz="5" w:space="2" w:color="404040"/>
         </w:pBdr>
-        <w:spacing w:before="120" w:after="60" w:line="240" w:lineRule="auto"/>
+        <w:spacing w:before="80" w:after="40" w:line="230" w:lineRule="exact"/>
       </w:pPr>
       <w:r>
         <w:rPr>
@@ -143,7 +143,7 @@
     <w:p>
       <w:pPr>
         <w:keepNext/>
-        <w:spacing w:before="120" w:after="10" w:line="240" w:lineRule="auto"/>
+        <w:spacing w:before="80" w:after="10" w:line="230" w:lineRule="exact"/>
       </w:pPr>
       <w:r>
         <w:rPr>
@@ -175,7 +175,7 @@
     <w:p>
       <w:pPr>
         <w:keepNext/>
-        <w:spacing w:before="10" w:after="60" w:line="240" w:lineRule="auto"/>
+        <w:spacing w:before="10" w:after="40" w:line="240" w:lineRule="auto"/>
         <w:rPr>
           <w:i/>
           <w:color w:val="303030"/>
@@ -193,7 +193,7 @@
           <w:caps w:val="0"/>
           <w:smallCaps w:val="0"/>
         </w:rPr>
-        <w:t>Channel Account Management</w:t>
+        <w:t>Channel Sales Manager</w:t>
       </w:r>
       <w:r>
         <w:rPr>
@@ -212,7 +212,7 @@
     <w:p>
       <w:pPr>
         <w:keepNext/>
-        <w:spacing w:after="80" w:line="240" w:lineRule="auto"/>
+        <w:spacing w:after="60" w:line="230" w:lineRule="exact"/>
       </w:pPr>
       <w:r>
         <w:rPr>
@@ -225,7 +225,7 @@
           <w:caps w:val="0"/>
           <w:smallCaps w:val="0"/>
         </w:rPr>
-        <w:t xml:space="preserve">Directed AT&amp;T channel sales across four states, with responsibility for 14 independent distributors and a broader national-retail partner network spanning 161 stores.</w:t>
+        <w:t xml:space="preserve">Led channel sales for DSI, an AT&amp;T master distributor, across four states and three channels, managing 14 independent distributors and a 161-store network across five national retailers.</w:t>
       </w:r>
     </w:p>
     <w:p>
@@ -236,85 +236,7 @@
           <w:ilvl w:val="0"/>
           <w:numId w:val="1"/>
         </w:numPr>
-        <w:spacing w:after="20" w:line="240" w:lineRule="auto"/>
-        <w:ind w:left="317" w:hanging="216"/>
-        <w:contextualSpacing w:val="0"/>
-      </w:pPr>
-      <w:r>
-        <w:rPr>
-          <w:rFonts w:ascii="Arial" w:hAnsi="Arial" w:eastAsia="Arial" w:cs="Arial"/>
-          <w:sz w:val="21"/>
-          <w:szCs w:val="21"/>
-          <w:color w:val="000000"/>
-          <w:b w:val="0"/>
-          <w:i w:val="0"/>
-          <w:caps w:val="0"/>
-          <w:smallCaps w:val="0"/>
-        </w:rPr>
-        <w:t>Launched the pilot B2B partner, built its prospecting pipeline, and led outbound coaching and co-selling with partner reps. Proved the operating model that led to a national rollout; the partner finished #1 nationally in net B2B sales in 2024 and 2025.</w:t>
-      </w:r>
-    </w:p>
-    <w:p>
-      <w:pPr>
-        <w:pStyle w:val="ResumeBullet"/>
-        <w:keepLines w:val="1"/>
-        <w:numPr>
-          <w:ilvl w:val="0"/>
-          <w:numId w:val="1"/>
-        </w:numPr>
-        <w:spacing w:after="20" w:line="240" w:lineRule="auto"/>
-        <w:ind w:left="317" w:hanging="216"/>
-        <w:contextualSpacing w:val="0"/>
-      </w:pPr>
-      <w:r>
-        <w:rPr>
-          <w:rFonts w:ascii="Arial" w:hAnsi="Arial" w:eastAsia="Arial" w:cs="Arial"/>
-          <w:sz w:val="21"/>
-          <w:szCs w:val="21"/>
-          <w:color w:val="000000"/>
-          <w:b w:val="0"/>
-          <w:i w:val="0"/>
-          <w:caps w:val="0"/>
-          <w:smallCaps w:val="0"/>
-        </w:rPr>
-        <w:t>Owned onboarding for new partner reps, from product training and certification through prospecting, quoting, and co-selling. Built the supporting curriculum, instructor guides, platform manuals, and troubleshooting resources; the training and certification program was later adopted nationally.</w:t>
-      </w:r>
-    </w:p>
-    <w:p>
-      <w:pPr>
-        <w:pStyle w:val="ResumeBullet"/>
-        <w:keepLines w:val="1"/>
-        <w:numPr>
-          <w:ilvl w:val="0"/>
-          <w:numId w:val="1"/>
-        </w:numPr>
-        <w:spacing w:after="20" w:line="240" w:lineRule="auto"/>
-        <w:ind w:left="317" w:hanging="216"/>
-        <w:contextualSpacing w:val="0"/>
-      </w:pPr>
-      <w:r>
-        <w:rPr>
-          <w:rFonts w:ascii="Arial" w:hAnsi="Arial" w:eastAsia="Arial" w:cs="Arial"/>
-          <w:sz w:val="21"/>
-          <w:szCs w:val="21"/>
-          <w:color w:val="000000"/>
-          <w:b w:val="0"/>
-          <w:i w:val="0"/>
-          <w:caps w:val="0"/>
-          <w:smallCaps w:val="0"/>
-        </w:rPr>
-        <w:t xml:space="preserve">Led joint business planning and recurring performance reviews with C-suite executives and regional partner leaders, defining market priorities, sales goals, and incentive programs to drive territory growth.</w:t>
-      </w:r>
-    </w:p>
-    <w:p>
-      <w:pPr>
-        <w:pStyle w:val="ResumeBullet"/>
-        <w:keepLines w:val="1"/>
-        <w:numPr>
-          <w:ilvl w:val="0"/>
-          <w:numId w:val="1"/>
-        </w:numPr>
-        <w:spacing w:after="20" w:line="240" w:lineRule="auto"/>
+        <w:spacing w:after="20" w:line="230" w:lineRule="exact"/>
         <w:ind w:left="317" w:hanging="216"/>
         <w:contextualSpacing w:val="0"/>
       </w:pPr>
@@ -340,7 +262,7 @@
           <w:ilvl w:val="0"/>
           <w:numId w:val="1"/>
         </w:numPr>
-        <w:spacing w:after="20" w:line="240" w:lineRule="auto"/>
+        <w:spacing w:after="20" w:line="230" w:lineRule="exact"/>
         <w:ind w:left="317" w:hanging="216"/>
         <w:contextualSpacing w:val="0"/>
       </w:pPr>
@@ -355,7 +277,7 @@
           <w:caps w:val="0"/>
           <w:smallCaps w:val="0"/>
         </w:rPr>
-        <w:t xml:space="preserve">Drove cross-functional channel initiatives with AT&amp;T leadership, retail account teams, and internal stakeholders. Repaired strained partner relationships by holding distributor executives accountable for corrective action and enforcing consistent sales and operating standards.</w:t>
+        <w:t xml:space="preserve">Launched the B2B channel and its pilot partner, built its prospecting pipeline, and led outbound coaching and co-selling with partner reps. Proved the operating model that led to a national rollout; the pilot partner finished #1 nationally in net B2B sales in 2024 and 2025.</w:t>
       </w:r>
     </w:p>
     <w:p>
@@ -366,7 +288,59 @@
           <w:ilvl w:val="0"/>
           <w:numId w:val="1"/>
         </w:numPr>
-        <w:spacing w:after="20" w:line="240" w:lineRule="auto"/>
+        <w:spacing w:after="20" w:line="230" w:lineRule="exact"/>
+        <w:ind w:left="317" w:hanging="216"/>
+        <w:contextualSpacing w:val="0"/>
+      </w:pPr>
+      <w:r>
+        <w:rPr>
+          <w:rFonts w:ascii="Arial" w:hAnsi="Arial" w:eastAsia="Arial" w:cs="Arial"/>
+          <w:sz w:val="21"/>
+          <w:szCs w:val="21"/>
+          <w:color w:val="000000"/>
+          <w:b w:val="0"/>
+          <w:i w:val="0"/>
+          <w:caps w:val="0"/>
+          <w:smallCaps w:val="0"/>
+        </w:rPr>
+        <w:t xml:space="preserve">Led joint business planning and recurring performance reviews with distributor executives and regional leaders at national sales partners, defining market priorities, sales goals, and incentive programs. Tracked results, designated distributor contacts for progress updates, and used field visits to verify implementation.</w:t>
+      </w:r>
+    </w:p>
+    <w:p>
+      <w:pPr>
+        <w:pStyle w:val="ResumeBullet"/>
+        <w:keepLines w:val="1"/>
+        <w:numPr>
+          <w:ilvl w:val="0"/>
+          <w:numId w:val="1"/>
+        </w:numPr>
+        <w:spacing w:after="20" w:line="230" w:lineRule="exact"/>
+        <w:ind w:left="317" w:hanging="216"/>
+        <w:contextualSpacing w:val="0"/>
+      </w:pPr>
+      <w:r>
+        <w:rPr>
+          <w:rFonts w:ascii="Arial" w:hAnsi="Arial" w:eastAsia="Arial" w:cs="Arial"/>
+          <w:sz w:val="21"/>
+          <w:szCs w:val="21"/>
+          <w:color w:val="000000"/>
+          <w:b w:val="0"/>
+          <w:i w:val="0"/>
+          <w:caps w:val="0"/>
+          <w:smallCaps w:val="0"/>
+        </w:rPr>
+        <w:t xml:space="preserve">Designed and built a partner onboarding and certification program, establishing standards for product knowledge, sales execution, platform use, and customer follow-up. Created curriculum, instructor guides, platform manuals, and troubleshooting resources; DSI later adopted the program nationally.</w:t>
+      </w:r>
+    </w:p>
+    <w:p>
+      <w:pPr>
+        <w:pStyle w:val="ResumeBullet"/>
+        <w:keepLines w:val="1"/>
+        <w:numPr>
+          <w:ilvl w:val="0"/>
+          <w:numId w:val="1"/>
+        </w:numPr>
+        <w:spacing w:after="20" w:line="230" w:lineRule="exact"/>
         <w:ind w:left="317" w:hanging="216"/>
         <w:contextualSpacing w:val="0"/>
       </w:pPr>
@@ -392,7 +366,59 @@
           <w:ilvl w:val="0"/>
           <w:numId w:val="1"/>
         </w:numPr>
-        <w:spacing w:after="20" w:line="240" w:lineRule="auto"/>
+        <w:spacing w:after="20" w:line="230" w:lineRule="exact"/>
+        <w:ind w:left="317" w:hanging="216"/>
+        <w:contextualSpacing w:val="0"/>
+      </w:pPr>
+      <w:r>
+        <w:rPr>
+          <w:rFonts w:ascii="Arial" w:hAnsi="Arial" w:eastAsia="Arial" w:cs="Arial"/>
+          <w:sz w:val="21"/>
+          <w:szCs w:val="21"/>
+          <w:color w:val="000000"/>
+          <w:b w:val="0"/>
+          <w:i w:val="0"/>
+          <w:caps w:val="0"/>
+          <w:smallCaps w:val="0"/>
+        </w:rPr>
+        <w:t xml:space="preserve">Designed customer-support and escalation processes adopted by Ignition Group, DSI’s call-center partner, including a customer follow-up framework that contributed to an 82% reduction in escalations reaching Costco headquarters. Repaired strained partner relationships by holding distributor executives accountable for corrective action and enforcing consistent sales and operating standards.</w:t>
+      </w:r>
+    </w:p>
+    <w:p>
+      <w:pPr>
+        <w:pStyle w:val="ResumeBullet"/>
+        <w:keepLines w:val="1"/>
+        <w:numPr>
+          <w:ilvl w:val="0"/>
+          <w:numId w:val="1"/>
+        </w:numPr>
+        <w:spacing w:after="20" w:line="230" w:lineRule="exact"/>
+        <w:ind w:left="317" w:hanging="216"/>
+        <w:contextualSpacing w:val="0"/>
+      </w:pPr>
+      <w:r>
+        <w:rPr>
+          <w:rFonts w:ascii="Arial" w:hAnsi="Arial" w:eastAsia="Arial" w:cs="Arial"/>
+          <w:sz w:val="21"/>
+          <w:szCs w:val="21"/>
+          <w:color w:val="000000"/>
+          <w:b w:val="0"/>
+          <w:i w:val="0"/>
+          <w:caps w:val="0"/>
+          <w:smallCaps w:val="0"/>
+        </w:rPr>
+        <w:t xml:space="preserve">Led field adoption for a Target Sara+ pilot, onboarding 300+ partner reps and translating seller feedback into product, workflow, and training improvements. The pilot proved the case for a nationwide rollout.</w:t>
+      </w:r>
+    </w:p>
+    <w:p>
+      <w:pPr>
+        <w:pStyle w:val="ResumeBullet"/>
+        <w:keepLines w:val="1"/>
+        <w:numPr>
+          <w:ilvl w:val="0"/>
+          <w:numId w:val="1"/>
+        </w:numPr>
+        <w:spacing w:after="20" w:line="230" w:lineRule="exact"/>
         <w:ind w:left="317" w:hanging="216"/>
         <w:contextualSpacing w:val="0"/>
       </w:pPr>
@@ -413,7 +439,7 @@
     <w:p>
       <w:pPr>
         <w:keepNext/>
-        <w:spacing w:before="120" w:after="10" w:line="240" w:lineRule="auto"/>
+        <w:spacing w:before="80" w:after="10" w:line="230" w:lineRule="exact"/>
       </w:pPr>
       <w:r>
         <w:rPr>
@@ -445,7 +471,7 @@
     <w:p>
       <w:pPr>
         <w:keepNext/>
-        <w:spacing w:before="10" w:after="60" w:line="240" w:lineRule="auto"/>
+        <w:spacing w:before="10" w:after="40" w:line="240" w:lineRule="auto"/>
       </w:pPr>
       <w:r>
         <w:rPr>
@@ -477,7 +503,7 @@
     <w:p>
       <w:pPr>
         <w:keepNext/>
-        <w:spacing w:after="80" w:line="240" w:lineRule="auto"/>
+        <w:spacing w:after="60" w:line="230" w:lineRule="exact"/>
       </w:pPr>
       <w:r>
         <w:rPr>
@@ -501,7 +527,7 @@
           <w:ilvl w:val="0"/>
           <w:numId w:val="1"/>
         </w:numPr>
-        <w:spacing w:after="20" w:line="240" w:lineRule="auto"/>
+        <w:spacing w:after="20" w:line="230" w:lineRule="exact"/>
         <w:ind w:left="317" w:hanging="216"/>
         <w:contextualSpacing w:val="0"/>
       </w:pPr>
@@ -527,7 +553,7 @@
           <w:ilvl w:val="0"/>
           <w:numId w:val="1"/>
         </w:numPr>
-        <w:spacing w:after="20" w:line="240" w:lineRule="auto"/>
+        <w:spacing w:after="20" w:line="230" w:lineRule="exact"/>
         <w:ind w:left="317" w:hanging="216"/>
         <w:contextualSpacing w:val="0"/>
       </w:pPr>
@@ -553,7 +579,7 @@
           <w:ilvl w:val="0"/>
           <w:numId w:val="1"/>
         </w:numPr>
-        <w:spacing w:after="20" w:line="240" w:lineRule="auto"/>
+        <w:spacing w:after="20" w:line="230" w:lineRule="exact"/>
         <w:ind w:left="317" w:hanging="216"/>
         <w:contextualSpacing w:val="0"/>
       </w:pPr>
@@ -574,7 +600,7 @@
     <w:p>
       <w:pPr>
         <w:keepNext/>
-        <w:spacing w:before="120" w:after="10" w:line="240" w:lineRule="auto"/>
+        <w:spacing w:before="80" w:after="10" w:line="230" w:lineRule="exact"/>
       </w:pPr>
       <w:r>
         <w:rPr>
@@ -606,7 +632,7 @@
     <w:p>
       <w:pPr>
         <w:keepNext/>
-        <w:spacing w:before="10" w:after="60" w:line="240" w:lineRule="auto"/>
+        <w:spacing w:before="10" w:after="40" w:line="240" w:lineRule="auto"/>
       </w:pPr>
       <w:r>
         <w:rPr>
@@ -643,7 +669,7 @@
           <w:ilvl w:val="0"/>
           <w:numId w:val="1"/>
         </w:numPr>
-        <w:spacing w:after="20" w:line="240" w:lineRule="auto"/>
+        <w:spacing w:after="20" w:line="230" w:lineRule="exact"/>
         <w:ind w:left="317" w:hanging="216"/>
         <w:contextualSpacing w:val="0"/>
       </w:pPr>
@@ -669,7 +695,7 @@
           <w:ilvl w:val="0"/>
           <w:numId w:val="1"/>
         </w:numPr>
-        <w:spacing w:after="20" w:line="240" w:lineRule="auto"/>
+        <w:spacing w:after="20" w:line="230" w:lineRule="exact"/>
         <w:ind w:left="317" w:hanging="216"/>
         <w:contextualSpacing w:val="0"/>
       </w:pPr>
@@ -693,7 +719,7 @@
         <w:pBdr>
           <w:bottom w:val="single" w:sz="5" w:space="2" w:color="404040"/>
         </w:pBdr>
-        <w:spacing w:before="120" w:after="60" w:line="240" w:lineRule="auto"/>
+        <w:spacing w:before="80" w:after="40" w:line="230" w:lineRule="exact"/>
       </w:pPr>
       <w:r>
         <w:rPr>

</xml_diff>